<commit_message>
New rules and new friend DM source code behaviour
Rules ready for playstore production review
</commit_message>
<xml_diff>
--- a/docs/$Mil Prompts.docx
+++ b/docs/$Mil Prompts.docx
@@ -468,7 +468,28 @@
         <w:rPr>
           <w:lang w:val="en-US"/>
         </w:rPr>
-        <w:t xml:space="preserve"> message in this instance should change from ‘[exercise] deleted’ to </w:t>
+        <w:t xml:space="preserve"> message in this instance should change </w:t>
+      </w:r>
+      <w:proofErr w:type="gramStart"/>
+      <w:r>
+        <w:rPr>
+          <w:lang w:val="en-US"/>
+        </w:rPr>
+        <w:t>from ‘[</w:t>
+      </w:r>
+      <w:proofErr w:type="gramEnd"/>
+      <w:r>
+        <w:rPr>
+          <w:lang w:val="en-US"/>
+        </w:rPr>
+        <w:t xml:space="preserve">exercise] deleted’ </w:t>
+      </w:r>
+      <w:proofErr w:type="gramStart"/>
+      <w:r>
+        <w:rPr>
+          <w:lang w:val="en-US"/>
+        </w:rPr>
+        <w:t xml:space="preserve">to </w:t>
       </w:r>
       <w:r>
         <w:rPr>
@@ -480,7 +501,14 @@
         <w:rPr>
           <w:lang w:val="en-US"/>
         </w:rPr>
-        <w:t>[new exercise</w:t>
+        <w:t>[</w:t>
+      </w:r>
+      <w:proofErr w:type="gramEnd"/>
+      <w:r>
+        <w:rPr>
+          <w:lang w:val="en-US"/>
+        </w:rPr>
+        <w:t>new exercise</w:t>
       </w:r>
       <w:r>
         <w:rPr>
@@ -501,19 +529,109 @@
         <w:br/>
         <w:t xml:space="preserve">Can we implement the above, leave out the personal trainer complaint option for first </w:t>
       </w:r>
+      <w:r>
+        <w:rPr>
+          <w:lang w:val="en-US"/>
+        </w:rPr>
+        <w:t>pass</w:t>
+      </w:r>
+      <w:r>
+        <w:rPr>
+          <w:lang w:val="en-US"/>
+        </w:rPr>
+        <w:t xml:space="preserve"> but leave it easy to add once we get the rest of that in.</w:t>
+      </w:r>
+      <w:r>
+        <w:rPr>
+          <w:lang w:val="en-US"/>
+        </w:rPr>
+        <w:t xml:space="preserve"> So new 3 dot menu button right next to exercise name, don’t make the </w:t>
+      </w:r>
+      <w:proofErr w:type="gramStart"/>
+      <w:r>
+        <w:rPr>
+          <w:lang w:val="en-US"/>
+        </w:rPr>
+        <w:t>exercise name</w:t>
+      </w:r>
+      <w:proofErr w:type="gramEnd"/>
+      <w:r>
+        <w:rPr>
+          <w:lang w:val="en-US"/>
+        </w:rPr>
+        <w:t xml:space="preserve"> area take up any less horizontal </w:t>
+      </w:r>
       <w:proofErr w:type="spellStart"/>
       <w:r>
         <w:rPr>
           <w:lang w:val="en-US"/>
         </w:rPr>
-        <w:t>aprse</w:t>
+        <w:t>spacve</w:t>
       </w:r>
       <w:proofErr w:type="spellEnd"/>
       <w:r>
         <w:rPr>
           <w:lang w:val="en-US"/>
         </w:rPr>
-        <w:t xml:space="preserve"> but leave it easy to add once we get the rest of that in.</w:t>
+        <w:t xml:space="preserve"> than it already is, its arguably too small already, instead horizontal scrolling added to row. Remove swipe to delete function (keep the engineering of the delete function, just remove the </w:t>
+      </w:r>
+      <w:proofErr w:type="spellStart"/>
+      <w:r>
+        <w:rPr>
+          <w:lang w:val="en-US"/>
+        </w:rPr>
+        <w:t>swip</w:t>
+      </w:r>
+      <w:proofErr w:type="spellEnd"/>
+      <w:r>
+        <w:rPr>
+          <w:lang w:val="en-US"/>
+        </w:rPr>
+        <w:t xml:space="preserve"> to delete feature), add delete function to 3 dot </w:t>
+      </w:r>
+      <w:proofErr w:type="gramStart"/>
+      <w:r>
+        <w:rPr>
+          <w:lang w:val="en-US"/>
+        </w:rPr>
+        <w:t>menu</w:t>
+      </w:r>
+      <w:proofErr w:type="gramEnd"/>
+      <w:r>
+        <w:rPr>
+          <w:lang w:val="en-US"/>
+        </w:rPr>
+        <w:t xml:space="preserve">, and add replace this exercise to 3 dot </w:t>
+      </w:r>
+      <w:proofErr w:type="gramStart"/>
+      <w:r>
+        <w:rPr>
+          <w:lang w:val="en-US"/>
+        </w:rPr>
+        <w:t>menu</w:t>
+      </w:r>
+      <w:proofErr w:type="gramEnd"/>
+      <w:r>
+        <w:rPr>
+          <w:lang w:val="en-US"/>
+        </w:rPr>
+        <w:t xml:space="preserve">. Cool </w:t>
+      </w:r>
+      <w:proofErr w:type="spellStart"/>
+      <w:proofErr w:type="gramStart"/>
+      <w:r>
+        <w:rPr>
+          <w:lang w:val="en-US"/>
+        </w:rPr>
+        <w:t>lets</w:t>
+      </w:r>
+      <w:proofErr w:type="spellEnd"/>
+      <w:proofErr w:type="gramEnd"/>
+      <w:r>
+        <w:rPr>
+          <w:lang w:val="en-US"/>
+        </w:rPr>
+        <w:t xml:space="preserve"> go!</w:t>
       </w:r>
       <w:r>
         <w:rPr>
@@ -538,35 +656,6 @@
           <w:lang w:val="en-US"/>
         </w:rPr>
         <w:br/>
-        <w:t xml:space="preserve">Can we next please add color theme choice selection to the project? Look at how </w:t>
-      </w:r>
-      <w:proofErr w:type="spellStart"/>
-      <w:r>
-        <w:rPr>
-          <w:lang w:val="en-US"/>
-        </w:rPr>
-        <w:t>razorsedge</w:t>
-      </w:r>
-      <w:proofErr w:type="spellEnd"/>
-      <w:r>
-        <w:rPr>
-          <w:lang w:val="en-US"/>
-        </w:rPr>
-        <w:t xml:space="preserve"> version has done it and then implement that here. What we want is user ability to easily select which primary secondary and </w:t>
-      </w:r>
-      <w:proofErr w:type="spellStart"/>
-      <w:r>
-        <w:rPr>
-          <w:lang w:val="en-US"/>
-        </w:rPr>
-        <w:t>teritiary</w:t>
-      </w:r>
-      <w:proofErr w:type="spellEnd"/>
-      <w:r>
-        <w:rPr>
-          <w:lang w:val="en-US"/>
-        </w:rPr>
-        <w:t xml:space="preserve"> color themes they choose for the display on their device for the app. </w:t>
       </w:r>
     </w:p>
     <w:sectPr>

</xml_diff>